<commit_message>
✨ Add "鍛鍊" category and enhance related functionality
- Introduced "鍛鍊" category with corresponding emoji and keywords across components.
- Updated AddRecordForm to include "鍛鍊" in category selection and keyword mapping.
- Enhanced metrics calculations to account for "鍛鍊" activities in capability and exercise hours.
- Improved MonthlyTable and capability chart to reflect new category and its implications on metrics.
- Updated documentation to include "鍛鍊" in type definitions and explanations.
</commit_message>
<xml_diff>
--- a/public/時間資產系統規則文件.docx
+++ b/public/時間資產系統規則文件.docx
@@ -1626,7 +1626,7 @@
                 <w:sz w:val="20"/>
                 <w:szCs w:val="20"/>
               </w:rPr>
-              <w:t xml:space="preserve">"工作" | "學習" | "副業" | "人際" | "休息"</w:t>
+              <w:t xml:space="preserve">"工作" | "學習" | "副業" | "人際" | "休息" | "鍛鍊"</w:t>
             </w:r>
           </w:p>
         </w:tc>
@@ -2108,6 +2108,724 @@
                 <w:szCs w:val="20"/>
               </w:rPr>
               <w:t xml:space="preserve">text-orange-500</w:t>
+            </w:r>
+          </w:p>
+        </w:tc>
+      </w:tr>
+    </w:tbl>
+    <w:p>
+      <w:pPr>
+        <w:spacing w:after="80" w:before="80"/>
+      </w:pPr>
+    </w:p>
+    <w:p>
+      <w:pPr>
+        <w:pStyle w:val="Heading3"/>
+        <w:spacing w:after="80" w:before="240"/>
+        <w:rPr>
+          <w:b/>
+          <w:bCs/>
+          <w:color w:val="1D4ED8"/>
+          <w:sz w:val="24"/>
+          <w:szCs w:val="24"/>
+        </w:rPr>
+      </w:pPr>
+      <w:r>
+        <w:t xml:space="preserve">六類別時間型態</w:t>
+      </w:r>
+    </w:p>
+    <w:tbl>
+      <w:tblPr>
+        <w:tblW w:type="pct" w:w="100%"/>
+        <w:tblBorders>
+          <w:top w:val="single" w:color="auto" w:sz="4"/>
+          <w:left w:val="single" w:color="auto" w:sz="4"/>
+          <w:bottom w:val="single" w:color="auto" w:sz="4"/>
+          <w:right w:val="single" w:color="auto" w:sz="4"/>
+          <w:insideH w:val="single" w:color="auto" w:sz="4"/>
+          <w:insideV w:val="single" w:color="auto" w:sz="4"/>
+        </w:tblBorders>
+        <w:tblCellMar>
+          <w:top w:type="dxa" w:w="80"/>
+          <w:bottom w:type="dxa" w:w="80"/>
+        </w:tblCellMar>
+      </w:tblPr>
+      <w:tblGrid>
+        <w:gridCol w:w="100"/>
+        <w:gridCol w:w="100"/>
+        <w:gridCol w:w="100"/>
+        <w:gridCol w:w="100"/>
+      </w:tblGrid>
+      <w:tr>
+        <w:tc>
+          <w:tcPr>
+            <w:shd w:color="DBEAFE" w:val="solid"/>
+            <w:tcMar>
+              <w:top w:type="dxa" w:w="60"/>
+              <w:left w:type="dxa" w:w="120"/>
+              <w:bottom w:type="dxa" w:w="60"/>
+              <w:right w:type="dxa" w:w="120"/>
+            </w:tcMar>
+          </w:tcPr>
+          <w:p>
+            <w:r>
+              <w:rPr>
+                <w:rFonts w:ascii="Microsoft JhengHei" w:cs="Microsoft JhengHei" w:eastAsia="Microsoft JhengHei" w:hAnsi="Microsoft JhengHei"/>
+                <w:b/>
+                <w:bCs/>
+                <w:color w:val="1E40AF"/>
+                <w:sz w:val="20"/>
+                <w:szCs w:val="20"/>
+              </w:rPr>
+              <w:t xml:space="preserve">類別</w:t>
+            </w:r>
+          </w:p>
+        </w:tc>
+        <w:tc>
+          <w:tcPr>
+            <w:shd w:color="DBEAFE" w:val="solid"/>
+            <w:tcMar>
+              <w:top w:type="dxa" w:w="60"/>
+              <w:left w:type="dxa" w:w="120"/>
+              <w:bottom w:type="dxa" w:w="60"/>
+              <w:right w:type="dxa" w:w="120"/>
+            </w:tcMar>
+          </w:tcPr>
+          <w:p>
+            <w:r>
+              <w:rPr>
+                <w:rFonts w:ascii="Microsoft JhengHei" w:cs="Microsoft JhengHei" w:eastAsia="Microsoft JhengHei" w:hAnsi="Microsoft JhengHei"/>
+                <w:b/>
+                <w:bCs/>
+                <w:color w:val="1E40AF"/>
+                <w:sz w:val="20"/>
+                <w:szCs w:val="20"/>
+              </w:rPr>
+              <w:t xml:space="preserve">Emoji</w:t>
+            </w:r>
+          </w:p>
+        </w:tc>
+        <w:tc>
+          <w:tcPr>
+            <w:shd w:color="DBEAFE" w:val="solid"/>
+            <w:tcMar>
+              <w:top w:type="dxa" w:w="60"/>
+              <w:left w:type="dxa" w:w="120"/>
+              <w:bottom w:type="dxa" w:w="60"/>
+              <w:right w:type="dxa" w:w="120"/>
+            </w:tcMar>
+          </w:tcPr>
+          <w:p>
+            <w:r>
+              <w:rPr>
+                <w:rFonts w:ascii="Microsoft JhengHei" w:cs="Microsoft JhengHei" w:eastAsia="Microsoft JhengHei" w:hAnsi="Microsoft JhengHei"/>
+                <w:b/>
+                <w:bCs/>
+                <w:color w:val="1E40AF"/>
+                <w:sz w:val="20"/>
+                <w:szCs w:val="20"/>
+              </w:rPr>
+              <w:t xml:space="preserve">時間型態</w:t>
+            </w:r>
+          </w:p>
+        </w:tc>
+        <w:tc>
+          <w:tcPr>
+            <w:shd w:color="DBEAFE" w:val="solid"/>
+            <w:tcMar>
+              <w:top w:type="dxa" w:w="60"/>
+              <w:left w:type="dxa" w:w="120"/>
+              <w:bottom w:type="dxa" w:w="60"/>
+              <w:right w:type="dxa" w:w="120"/>
+            </w:tcMar>
+          </w:tcPr>
+          <w:p>
+            <w:r>
+              <w:rPr>
+                <w:rFonts w:ascii="Microsoft JhengHei" w:cs="Microsoft JhengHei" w:eastAsia="Microsoft JhengHei" w:hAnsi="Microsoft JhengHei"/>
+                <w:b/>
+                <w:bCs/>
+                <w:color w:val="1E40AF"/>
+                <w:sz w:val="20"/>
+                <w:szCs w:val="20"/>
+              </w:rPr>
+              <w:t xml:space="preserve">歸因說明</w:t>
+            </w:r>
+          </w:p>
+        </w:tc>
+      </w:tr>
+      <w:tr>
+        <w:tc>
+          <w:tcPr>
+            <w:tcMar>
+              <w:top w:type="dxa" w:w="60"/>
+              <w:left w:type="dxa" w:w="120"/>
+              <w:bottom w:type="dxa" w:w="60"/>
+              <w:right w:type="dxa" w:w="120"/>
+            </w:tcMar>
+          </w:tcPr>
+          <w:p>
+            <w:r>
+              <w:rPr>
+                <w:rFonts w:ascii="Microsoft JhengHei" w:cs="Microsoft JhengHei" w:eastAsia="Microsoft JhengHei" w:hAnsi="Microsoft JhengHei"/>
+                <w:b w:val="false"/>
+                <w:bCs w:val="false"/>
+                <w:color w:val="374151"/>
+                <w:sz w:val="20"/>
+                <w:szCs w:val="20"/>
+              </w:rPr>
+              <w:t xml:space="preserve">工作</w:t>
+            </w:r>
+          </w:p>
+        </w:tc>
+        <w:tc>
+          <w:tcPr>
+            <w:tcMar>
+              <w:top w:type="dxa" w:w="60"/>
+              <w:left w:type="dxa" w:w="120"/>
+              <w:bottom w:type="dxa" w:w="60"/>
+              <w:right w:type="dxa" w:w="120"/>
+            </w:tcMar>
+          </w:tcPr>
+          <w:p>
+            <w:r>
+              <w:rPr>
+                <w:rFonts w:ascii="Microsoft JhengHei" w:cs="Microsoft JhengHei" w:eastAsia="Microsoft JhengHei" w:hAnsi="Microsoft JhengHei"/>
+                <w:b w:val="false"/>
+                <w:bCs w:val="false"/>
+                <w:color w:val="374151"/>
+                <w:sz w:val="20"/>
+                <w:szCs w:val="20"/>
+              </w:rPr>
+              <w:t xml:space="preserve">💼</w:t>
+            </w:r>
+          </w:p>
+        </w:tc>
+        <w:tc>
+          <w:tcPr>
+            <w:tcMar>
+              <w:top w:type="dxa" w:w="60"/>
+              <w:left w:type="dxa" w:w="120"/>
+              <w:bottom w:type="dxa" w:w="60"/>
+              <w:right w:type="dxa" w:w="120"/>
+            </w:tcMar>
+          </w:tcPr>
+          <w:p>
+            <w:r>
+              <w:rPr>
+                <w:rFonts w:ascii="Microsoft JhengHei" w:cs="Microsoft JhengHei" w:eastAsia="Microsoft JhengHei" w:hAnsi="Microsoft JhengHei"/>
+                <w:b w:val="false"/>
+                <w:bCs w:val="false"/>
+                <w:color w:val="374151"/>
+                <w:sz w:val="20"/>
+                <w:szCs w:val="20"/>
+              </w:rPr>
+              <w:t xml:space="preserve">生產型</w:t>
+            </w:r>
+          </w:p>
+        </w:tc>
+        <w:tc>
+          <w:tcPr>
+            <w:tcMar>
+              <w:top w:type="dxa" w:w="60"/>
+              <w:left w:type="dxa" w:w="120"/>
+              <w:bottom w:type="dxa" w:w="60"/>
+              <w:right w:type="dxa" w:w="120"/>
+            </w:tcMar>
+          </w:tcPr>
+          <w:p>
+            <w:r>
+              <w:rPr>
+                <w:rFonts w:ascii="Microsoft JhengHei" w:cs="Microsoft JhengHei" w:eastAsia="Microsoft JhengHei" w:hAnsi="Microsoft JhengHei"/>
+                <w:b w:val="false"/>
+                <w:bCs w:val="false"/>
+                <w:color w:val="374151"/>
+                <w:sz w:val="20"/>
+                <w:szCs w:val="20"/>
+              </w:rPr>
+              <w:t xml:space="preserve">調整時間 30% + 強化能力 70%</w:t>
+            </w:r>
+          </w:p>
+        </w:tc>
+      </w:tr>
+      <w:tr>
+        <w:tc>
+          <w:tcPr>
+            <w:shd w:color="F9FAFB" w:val="solid"/>
+            <w:tcMar>
+              <w:top w:type="dxa" w:w="60"/>
+              <w:left w:type="dxa" w:w="120"/>
+              <w:bottom w:type="dxa" w:w="60"/>
+              <w:right w:type="dxa" w:w="120"/>
+            </w:tcMar>
+          </w:tcPr>
+          <w:p>
+            <w:r>
+              <w:rPr>
+                <w:rFonts w:ascii="Microsoft JhengHei" w:cs="Microsoft JhengHei" w:eastAsia="Microsoft JhengHei" w:hAnsi="Microsoft JhengHei"/>
+                <w:b w:val="false"/>
+                <w:bCs w:val="false"/>
+                <w:color w:val="374151"/>
+                <w:sz w:val="20"/>
+                <w:szCs w:val="20"/>
+              </w:rPr>
+              <w:t xml:space="preserve">學習</w:t>
+            </w:r>
+          </w:p>
+        </w:tc>
+        <w:tc>
+          <w:tcPr>
+            <w:shd w:color="F9FAFB" w:val="solid"/>
+            <w:tcMar>
+              <w:top w:type="dxa" w:w="60"/>
+              <w:left w:type="dxa" w:w="120"/>
+              <w:bottom w:type="dxa" w:w="60"/>
+              <w:right w:type="dxa" w:w="120"/>
+            </w:tcMar>
+          </w:tcPr>
+          <w:p>
+            <w:r>
+              <w:rPr>
+                <w:rFonts w:ascii="Microsoft JhengHei" w:cs="Microsoft JhengHei" w:eastAsia="Microsoft JhengHei" w:hAnsi="Microsoft JhengHei"/>
+                <w:b w:val="false"/>
+                <w:bCs w:val="false"/>
+                <w:color w:val="374151"/>
+                <w:sz w:val="20"/>
+                <w:szCs w:val="20"/>
+              </w:rPr>
+              <w:t xml:space="preserve">📚</w:t>
+            </w:r>
+          </w:p>
+        </w:tc>
+        <w:tc>
+          <w:tcPr>
+            <w:shd w:color="F9FAFB" w:val="solid"/>
+            <w:tcMar>
+              <w:top w:type="dxa" w:w="60"/>
+              <w:left w:type="dxa" w:w="120"/>
+              <w:bottom w:type="dxa" w:w="60"/>
+              <w:right w:type="dxa" w:w="120"/>
+            </w:tcMar>
+          </w:tcPr>
+          <w:p>
+            <w:r>
+              <w:rPr>
+                <w:rFonts w:ascii="Microsoft JhengHei" w:cs="Microsoft JhengHei" w:eastAsia="Microsoft JhengHei" w:hAnsi="Microsoft JhengHei"/>
+                <w:b w:val="false"/>
+                <w:bCs w:val="false"/>
+                <w:color w:val="374151"/>
+                <w:sz w:val="20"/>
+                <w:szCs w:val="20"/>
+              </w:rPr>
+              <w:t xml:space="preserve">成長型</w:t>
+            </w:r>
+          </w:p>
+        </w:tc>
+        <w:tc>
+          <w:tcPr>
+            <w:shd w:color="F9FAFB" w:val="solid"/>
+            <w:tcMar>
+              <w:top w:type="dxa" w:w="60"/>
+              <w:left w:type="dxa" w:w="120"/>
+              <w:bottom w:type="dxa" w:w="60"/>
+              <w:right w:type="dxa" w:w="120"/>
+            </w:tcMar>
+          </w:tcPr>
+          <w:p>
+            <w:r>
+              <w:rPr>
+                <w:rFonts w:ascii="Microsoft JhengHei" w:cs="Microsoft JhengHei" w:eastAsia="Microsoft JhengHei" w:hAnsi="Microsoft JhengHei"/>
+                <w:b w:val="false"/>
+                <w:bCs w:val="false"/>
+                <w:color w:val="374151"/>
+                <w:sz w:val="20"/>
+                <w:szCs w:val="20"/>
+              </w:rPr>
+              <w:t xml:space="preserve">增加技能 50% + 增加知識 50%</w:t>
+            </w:r>
+          </w:p>
+        </w:tc>
+      </w:tr>
+      <w:tr>
+        <w:tc>
+          <w:tcPr>
+            <w:tcMar>
+              <w:top w:type="dxa" w:w="60"/>
+              <w:left w:type="dxa" w:w="120"/>
+              <w:bottom w:type="dxa" w:w="60"/>
+              <w:right w:type="dxa" w:w="120"/>
+            </w:tcMar>
+          </w:tcPr>
+          <w:p>
+            <w:r>
+              <w:rPr>
+                <w:rFonts w:ascii="Microsoft JhengHei" w:cs="Microsoft JhengHei" w:eastAsia="Microsoft JhengHei" w:hAnsi="Microsoft JhengHei"/>
+                <w:b w:val="false"/>
+                <w:bCs w:val="false"/>
+                <w:color w:val="374151"/>
+                <w:sz w:val="20"/>
+                <w:szCs w:val="20"/>
+              </w:rPr>
+              <w:t xml:space="preserve">副業</w:t>
+            </w:r>
+          </w:p>
+        </w:tc>
+        <w:tc>
+          <w:tcPr>
+            <w:tcMar>
+              <w:top w:type="dxa" w:w="60"/>
+              <w:left w:type="dxa" w:w="120"/>
+              <w:bottom w:type="dxa" w:w="60"/>
+              <w:right w:type="dxa" w:w="120"/>
+            </w:tcMar>
+          </w:tcPr>
+          <w:p>
+            <w:r>
+              <w:rPr>
+                <w:rFonts w:ascii="Microsoft JhengHei" w:cs="Microsoft JhengHei" w:eastAsia="Microsoft JhengHei" w:hAnsi="Microsoft JhengHei"/>
+                <w:b w:val="false"/>
+                <w:bCs w:val="false"/>
+                <w:color w:val="374151"/>
+                <w:sz w:val="20"/>
+                <w:szCs w:val="20"/>
+              </w:rPr>
+              <w:t xml:space="preserve">🌱</w:t>
+            </w:r>
+          </w:p>
+        </w:tc>
+        <w:tc>
+          <w:tcPr>
+            <w:tcMar>
+              <w:top w:type="dxa" w:w="60"/>
+              <w:left w:type="dxa" w:w="120"/>
+              <w:bottom w:type="dxa" w:w="60"/>
+              <w:right w:type="dxa" w:w="120"/>
+            </w:tcMar>
+          </w:tcPr>
+          <w:p>
+            <w:r>
+              <w:rPr>
+                <w:rFonts w:ascii="Microsoft JhengHei" w:cs="Microsoft JhengHei" w:eastAsia="Microsoft JhengHei" w:hAnsi="Microsoft JhengHei"/>
+                <w:b w:val="false"/>
+                <w:bCs w:val="false"/>
+                <w:color w:val="374151"/>
+                <w:sz w:val="20"/>
+                <w:szCs w:val="20"/>
+              </w:rPr>
+              <w:t xml:space="preserve">成長型</w:t>
+            </w:r>
+          </w:p>
+        </w:tc>
+        <w:tc>
+          <w:tcPr>
+            <w:tcMar>
+              <w:top w:type="dxa" w:w="60"/>
+              <w:left w:type="dxa" w:w="120"/>
+              <w:bottom w:type="dxa" w:w="60"/>
+              <w:right w:type="dxa" w:w="120"/>
+            </w:tcMar>
+          </w:tcPr>
+          <w:p>
+            <w:r>
+              <w:rPr>
+                <w:rFonts w:ascii="Microsoft JhengHei" w:cs="Microsoft JhengHei" w:eastAsia="Microsoft JhengHei" w:hAnsi="Microsoft JhengHei"/>
+                <w:b w:val="false"/>
+                <w:bCs w:val="false"/>
+                <w:color w:val="374151"/>
+                <w:sz w:val="20"/>
+                <w:szCs w:val="20"/>
+              </w:rPr>
+              <w:t xml:space="preserve">增加技能 100%</w:t>
+            </w:r>
+          </w:p>
+        </w:tc>
+      </w:tr>
+      <w:tr>
+        <w:tc>
+          <w:tcPr>
+            <w:shd w:color="F9FAFB" w:val="solid"/>
+            <w:tcMar>
+              <w:top w:type="dxa" w:w="60"/>
+              <w:left w:type="dxa" w:w="120"/>
+              <w:bottom w:type="dxa" w:w="60"/>
+              <w:right w:type="dxa" w:w="120"/>
+            </w:tcMar>
+          </w:tcPr>
+          <w:p>
+            <w:r>
+              <w:rPr>
+                <w:rFonts w:ascii="Microsoft JhengHei" w:cs="Microsoft JhengHei" w:eastAsia="Microsoft JhengHei" w:hAnsi="Microsoft JhengHei"/>
+                <w:b w:val="false"/>
+                <w:bCs w:val="false"/>
+                <w:color w:val="374151"/>
+                <w:sz w:val="20"/>
+                <w:szCs w:val="20"/>
+              </w:rPr>
+              <w:t xml:space="preserve">人際</w:t>
+            </w:r>
+          </w:p>
+        </w:tc>
+        <w:tc>
+          <w:tcPr>
+            <w:shd w:color="F9FAFB" w:val="solid"/>
+            <w:tcMar>
+              <w:top w:type="dxa" w:w="60"/>
+              <w:left w:type="dxa" w:w="120"/>
+              <w:bottom w:type="dxa" w:w="60"/>
+              <w:right w:type="dxa" w:w="120"/>
+            </w:tcMar>
+          </w:tcPr>
+          <w:p>
+            <w:r>
+              <w:rPr>
+                <w:rFonts w:ascii="Microsoft JhengHei" w:cs="Microsoft JhengHei" w:eastAsia="Microsoft JhengHei" w:hAnsi="Microsoft JhengHei"/>
+                <w:b w:val="false"/>
+                <w:bCs w:val="false"/>
+                <w:color w:val="374151"/>
+                <w:sz w:val="20"/>
+                <w:szCs w:val="20"/>
+              </w:rPr>
+              <w:t xml:space="preserve">💛</w:t>
+            </w:r>
+          </w:p>
+        </w:tc>
+        <w:tc>
+          <w:tcPr>
+            <w:shd w:color="F9FAFB" w:val="solid"/>
+            <w:tcMar>
+              <w:top w:type="dxa" w:w="60"/>
+              <w:left w:type="dxa" w:w="120"/>
+              <w:bottom w:type="dxa" w:w="60"/>
+              <w:right w:type="dxa" w:w="120"/>
+            </w:tcMar>
+          </w:tcPr>
+          <w:p>
+            <w:r>
+              <w:rPr>
+                <w:rFonts w:ascii="Microsoft JhengHei" w:cs="Microsoft JhengHei" w:eastAsia="Microsoft JhengHei" w:hAnsi="Microsoft JhengHei"/>
+                <w:b w:val="false"/>
+                <w:bCs w:val="false"/>
+                <w:color w:val="374151"/>
+                <w:sz w:val="20"/>
+                <w:szCs w:val="20"/>
+              </w:rPr>
+              <w:t xml:space="preserve">關係型</w:t>
+            </w:r>
+          </w:p>
+        </w:tc>
+        <w:tc>
+          <w:tcPr>
+            <w:shd w:color="F9FAFB" w:val="solid"/>
+            <w:tcMar>
+              <w:top w:type="dxa" w:w="60"/>
+              <w:left w:type="dxa" w:w="120"/>
+              <w:bottom w:type="dxa" w:w="60"/>
+              <w:right w:type="dxa" w:w="120"/>
+            </w:tcMar>
+          </w:tcPr>
+          <w:p>
+            <w:r>
+              <w:rPr>
+                <w:rFonts w:ascii="Microsoft JhengHei" w:cs="Microsoft JhengHei" w:eastAsia="Microsoft JhengHei" w:hAnsi="Microsoft JhengHei"/>
+                <w:b w:val="false"/>
+                <w:bCs w:val="false"/>
+                <w:color w:val="374151"/>
+                <w:sz w:val="20"/>
+                <w:szCs w:val="20"/>
+              </w:rPr>
+              <w:t xml:space="preserve">運用人脈 100%</w:t>
+            </w:r>
+          </w:p>
+        </w:tc>
+      </w:tr>
+      <w:tr>
+        <w:tc>
+          <w:tcPr>
+            <w:tcMar>
+              <w:top w:type="dxa" w:w="60"/>
+              <w:left w:type="dxa" w:w="120"/>
+              <w:bottom w:type="dxa" w:w="60"/>
+              <w:right w:type="dxa" w:w="120"/>
+            </w:tcMar>
+          </w:tcPr>
+          <w:p>
+            <w:r>
+              <w:rPr>
+                <w:rFonts w:ascii="Microsoft JhengHei" w:cs="Microsoft JhengHei" w:eastAsia="Microsoft JhengHei" w:hAnsi="Microsoft JhengHei"/>
+                <w:b w:val="false"/>
+                <w:bCs w:val="false"/>
+                <w:color w:val="374151"/>
+                <w:sz w:val="20"/>
+                <w:szCs w:val="20"/>
+              </w:rPr>
+              <w:t xml:space="preserve">休息</w:t>
+            </w:r>
+          </w:p>
+        </w:tc>
+        <w:tc>
+          <w:tcPr>
+            <w:tcMar>
+              <w:top w:type="dxa" w:w="60"/>
+              <w:left w:type="dxa" w:w="120"/>
+              <w:bottom w:type="dxa" w:w="60"/>
+              <w:right w:type="dxa" w:w="120"/>
+            </w:tcMar>
+          </w:tcPr>
+          <w:p>
+            <w:r>
+              <w:rPr>
+                <w:rFonts w:ascii="Microsoft JhengHei" w:cs="Microsoft JhengHei" w:eastAsia="Microsoft JhengHei" w:hAnsi="Microsoft JhengHei"/>
+                <w:b w:val="false"/>
+                <w:bCs w:val="false"/>
+                <w:color w:val="374151"/>
+                <w:sz w:val="20"/>
+                <w:szCs w:val="20"/>
+              </w:rPr>
+              <w:t xml:space="preserve">🌿</w:t>
+            </w:r>
+          </w:p>
+        </w:tc>
+        <w:tc>
+          <w:tcPr>
+            <w:tcMar>
+              <w:top w:type="dxa" w:w="60"/>
+              <w:left w:type="dxa" w:w="120"/>
+              <w:bottom w:type="dxa" w:w="60"/>
+              <w:right w:type="dxa" w:w="120"/>
+            </w:tcMar>
+          </w:tcPr>
+          <w:p>
+            <w:r>
+              <w:rPr>
+                <w:rFonts w:ascii="Microsoft JhengHei" w:cs="Microsoft JhengHei" w:eastAsia="Microsoft JhengHei" w:hAnsi="Microsoft JhengHei"/>
+                <w:b w:val="false"/>
+                <w:bCs w:val="false"/>
+                <w:color w:val="374151"/>
+                <w:sz w:val="20"/>
+                <w:szCs w:val="20"/>
+              </w:rPr>
+              <w:t xml:space="preserve">恢復型</w:t>
+            </w:r>
+          </w:p>
+        </w:tc>
+        <w:tc>
+          <w:tcPr>
+            <w:tcMar>
+              <w:top w:type="dxa" w:w="60"/>
+              <w:left w:type="dxa" w:w="120"/>
+              <w:bottom w:type="dxa" w:w="60"/>
+              <w:right w:type="dxa" w:w="120"/>
+            </w:tcMar>
+          </w:tcPr>
+          <w:p>
+            <w:r>
+              <w:rPr>
+                <w:rFonts w:ascii="Microsoft JhengHei" w:cs="Microsoft JhengHei" w:eastAsia="Microsoft JhengHei" w:hAnsi="Microsoft JhengHei"/>
+                <w:b w:val="false"/>
+                <w:bCs w:val="false"/>
+                <w:color w:val="374151"/>
+                <w:sz w:val="20"/>
+                <w:szCs w:val="20"/>
+              </w:rPr>
+              <w:t xml:space="preserve">增加體力 100%（被動恢復）</w:t>
+            </w:r>
+          </w:p>
+        </w:tc>
+      </w:tr>
+      <w:tr>
+        <w:tc>
+          <w:tcPr>
+            <w:shd w:color="F9FAFB" w:val="solid"/>
+            <w:tcMar>
+              <w:top w:type="dxa" w:w="60"/>
+              <w:left w:type="dxa" w:w="120"/>
+              <w:bottom w:type="dxa" w:w="60"/>
+              <w:right w:type="dxa" w:w="120"/>
+            </w:tcMar>
+          </w:tcPr>
+          <w:p>
+            <w:r>
+              <w:rPr>
+                <w:rFonts w:ascii="Microsoft JhengHei" w:cs="Microsoft JhengHei" w:eastAsia="Microsoft JhengHei" w:hAnsi="Microsoft JhengHei"/>
+                <w:b w:val="false"/>
+                <w:bCs w:val="false"/>
+                <w:color w:val="374151"/>
+                <w:sz w:val="20"/>
+                <w:szCs w:val="20"/>
+              </w:rPr>
+              <w:t xml:space="preserve">鍛鍊</w:t>
+            </w:r>
+          </w:p>
+        </w:tc>
+        <w:tc>
+          <w:tcPr>
+            <w:shd w:color="F9FAFB" w:val="solid"/>
+            <w:tcMar>
+              <w:top w:type="dxa" w:w="60"/>
+              <w:left w:type="dxa" w:w="120"/>
+              <w:bottom w:type="dxa" w:w="60"/>
+              <w:right w:type="dxa" w:w="120"/>
+            </w:tcMar>
+          </w:tcPr>
+          <w:p>
+            <w:r>
+              <w:rPr>
+                <w:rFonts w:ascii="Microsoft JhengHei" w:cs="Microsoft JhengHei" w:eastAsia="Microsoft JhengHei" w:hAnsi="Microsoft JhengHei"/>
+                <w:b w:val="false"/>
+                <w:bCs w:val="false"/>
+                <w:color w:val="374151"/>
+                <w:sz w:val="20"/>
+                <w:szCs w:val="20"/>
+              </w:rPr>
+              <w:t xml:space="preserve">🏃</w:t>
+            </w:r>
+          </w:p>
+        </w:tc>
+        <w:tc>
+          <w:tcPr>
+            <w:shd w:color="F9FAFB" w:val="solid"/>
+            <w:tcMar>
+              <w:top w:type="dxa" w:w="60"/>
+              <w:left w:type="dxa" w:w="120"/>
+              <w:bottom w:type="dxa" w:w="60"/>
+              <w:right w:type="dxa" w:w="120"/>
+            </w:tcMar>
+          </w:tcPr>
+          <w:p>
+            <w:r>
+              <w:rPr>
+                <w:rFonts w:ascii="Microsoft JhengHei" w:cs="Microsoft JhengHei" w:eastAsia="Microsoft JhengHei" w:hAnsi="Microsoft JhengHei"/>
+                <w:b w:val="false"/>
+                <w:bCs w:val="false"/>
+                <w:color w:val="374151"/>
+                <w:sz w:val="20"/>
+                <w:szCs w:val="20"/>
+              </w:rPr>
+              <w:t xml:space="preserve">恢復型</w:t>
+            </w:r>
+          </w:p>
+        </w:tc>
+        <w:tc>
+          <w:tcPr>
+            <w:shd w:color="F9FAFB" w:val="solid"/>
+            <w:tcMar>
+              <w:top w:type="dxa" w:w="60"/>
+              <w:left w:type="dxa" w:w="120"/>
+              <w:bottom w:type="dxa" w:w="60"/>
+              <w:right w:type="dxa" w:w="120"/>
+            </w:tcMar>
+          </w:tcPr>
+          <w:p>
+            <w:r>
+              <w:rPr>
+                <w:rFonts w:ascii="Microsoft JhengHei" w:cs="Microsoft JhengHei" w:eastAsia="Microsoft JhengHei" w:hAnsi="Microsoft JhengHei"/>
+                <w:b w:val="false"/>
+                <w:bCs w:val="false"/>
+                <w:color w:val="374151"/>
+                <w:sz w:val="20"/>
+                <w:szCs w:val="20"/>
+              </w:rPr>
+              <w:t xml:space="preserve">增加體力 100%（主動投資體能）</w:t>
             </w:r>
           </w:p>
         </w:tc>
@@ -4653,7 +5371,7 @@
                 <w:sz w:val="20"/>
                 <w:szCs w:val="20"/>
               </w:rPr>
-              <w:t xml:space="preserve">學習</w:t>
+              <w:t xml:space="preserve">鍛鍊</w:t>
             </w:r>
           </w:p>
         </w:tc>
@@ -4699,6 +5417,29 @@
                 <w:sz w:val="20"/>
                 <w:szCs w:val="20"/>
               </w:rPr>
+              <w:t xml:space="preserve">×1.0</w:t>
+            </w:r>
+          </w:p>
+        </w:tc>
+        <w:tc>
+          <w:tcPr>
+            <w:tcMar>
+              <w:top w:type="dxa" w:w="60"/>
+              <w:left w:type="dxa" w:w="120"/>
+              <w:bottom w:type="dxa" w:w="60"/>
+              <w:right w:type="dxa" w:w="120"/>
+            </w:tcMar>
+          </w:tcPr>
+          <w:p>
+            <w:r>
+              <w:rPr>
+                <w:rFonts w:ascii="Microsoft JhengHei" w:cs="Microsoft JhengHei" w:eastAsia="Microsoft JhengHei" w:hAnsi="Microsoft JhengHei"/>
+                <w:b w:val="false"/>
+                <w:bCs w:val="false"/>
+                <w:color w:val="374151"/>
+                <w:sz w:val="20"/>
+                <w:szCs w:val="20"/>
+              </w:rPr>
               <w:t xml:space="preserve">—</w:t>
             </w:r>
           </w:p>
@@ -4745,29 +5486,6 @@
                 <w:sz w:val="20"/>
                 <w:szCs w:val="20"/>
               </w:rPr>
-              <w:t xml:space="preserve">×0.5</w:t>
-            </w:r>
-          </w:p>
-        </w:tc>
-        <w:tc>
-          <w:tcPr>
-            <w:tcMar>
-              <w:top w:type="dxa" w:w="60"/>
-              <w:left w:type="dxa" w:w="120"/>
-              <w:bottom w:type="dxa" w:w="60"/>
-              <w:right w:type="dxa" w:w="120"/>
-            </w:tcMar>
-          </w:tcPr>
-          <w:p>
-            <w:r>
-              <w:rPr>
-                <w:rFonts w:ascii="Microsoft JhengHei" w:cs="Microsoft JhengHei" w:eastAsia="Microsoft JhengHei" w:hAnsi="Microsoft JhengHei"/>
-                <w:b w:val="false"/>
-                <w:bCs w:val="false"/>
-                <w:color w:val="374151"/>
-                <w:sz w:val="20"/>
-                <w:szCs w:val="20"/>
-              </w:rPr>
               <w:t xml:space="preserve">—</w:t>
             </w:r>
           </w:p>
@@ -4791,7 +5509,7 @@
                 <w:sz w:val="20"/>
                 <w:szCs w:val="20"/>
               </w:rPr>
-              <w:t xml:space="preserve">×0.5</w:t>
+              <w:t xml:space="preserve">—</w:t>
             </w:r>
           </w:p>
         </w:tc>
@@ -4817,7 +5535,7 @@
                 <w:sz w:val="20"/>
                 <w:szCs w:val="20"/>
               </w:rPr>
-              <w:t xml:space="preserve">副業</w:t>
+              <w:t xml:space="preserve">學習</w:t>
             </w:r>
           </w:p>
         </w:tc>
@@ -4913,7 +5631,7 @@
                 <w:sz w:val="20"/>
                 <w:szCs w:val="20"/>
               </w:rPr>
-              <w:t xml:space="preserve">×1.0</w:t>
+              <w:t xml:space="preserve">×0.5</w:t>
             </w:r>
           </w:p>
         </w:tc>
@@ -4961,7 +5679,7 @@
                 <w:sz w:val="20"/>
                 <w:szCs w:val="20"/>
               </w:rPr>
-              <w:t xml:space="preserve">—</w:t>
+              <w:t xml:space="preserve">×0.5</w:t>
             </w:r>
           </w:p>
         </w:tc>
@@ -4986,12 +5704,177 @@
                 <w:sz w:val="20"/>
                 <w:szCs w:val="20"/>
               </w:rPr>
+              <w:t xml:space="preserve">副業</w:t>
+            </w:r>
+          </w:p>
+        </w:tc>
+        <w:tc>
+          <w:tcPr>
+            <w:tcMar>
+              <w:top w:type="dxa" w:w="60"/>
+              <w:left w:type="dxa" w:w="120"/>
+              <w:bottom w:type="dxa" w:w="60"/>
+              <w:right w:type="dxa" w:w="120"/>
+            </w:tcMar>
+          </w:tcPr>
+          <w:p>
+            <w:r>
+              <w:rPr>
+                <w:rFonts w:ascii="Microsoft JhengHei" w:cs="Microsoft JhengHei" w:eastAsia="Microsoft JhengHei" w:hAnsi="Microsoft JhengHei"/>
+                <w:b w:val="false"/>
+                <w:bCs w:val="false"/>
+                <w:color w:val="374151"/>
+                <w:sz w:val="20"/>
+                <w:szCs w:val="20"/>
+              </w:rPr>
+              <w:t xml:space="preserve">—</w:t>
+            </w:r>
+          </w:p>
+        </w:tc>
+        <w:tc>
+          <w:tcPr>
+            <w:tcMar>
+              <w:top w:type="dxa" w:w="60"/>
+              <w:left w:type="dxa" w:w="120"/>
+              <w:bottom w:type="dxa" w:w="60"/>
+              <w:right w:type="dxa" w:w="120"/>
+            </w:tcMar>
+          </w:tcPr>
+          <w:p>
+            <w:r>
+              <w:rPr>
+                <w:rFonts w:ascii="Microsoft JhengHei" w:cs="Microsoft JhengHei" w:eastAsia="Microsoft JhengHei" w:hAnsi="Microsoft JhengHei"/>
+                <w:b w:val="false"/>
+                <w:bCs w:val="false"/>
+                <w:color w:val="374151"/>
+                <w:sz w:val="20"/>
+                <w:szCs w:val="20"/>
+              </w:rPr>
+              <w:t xml:space="preserve">—</w:t>
+            </w:r>
+          </w:p>
+        </w:tc>
+        <w:tc>
+          <w:tcPr>
+            <w:tcMar>
+              <w:top w:type="dxa" w:w="60"/>
+              <w:left w:type="dxa" w:w="120"/>
+              <w:bottom w:type="dxa" w:w="60"/>
+              <w:right w:type="dxa" w:w="120"/>
+            </w:tcMar>
+          </w:tcPr>
+          <w:p>
+            <w:r>
+              <w:rPr>
+                <w:rFonts w:ascii="Microsoft JhengHei" w:cs="Microsoft JhengHei" w:eastAsia="Microsoft JhengHei" w:hAnsi="Microsoft JhengHei"/>
+                <w:b w:val="false"/>
+                <w:bCs w:val="false"/>
+                <w:color w:val="374151"/>
+                <w:sz w:val="20"/>
+                <w:szCs w:val="20"/>
+              </w:rPr>
+              <w:t xml:space="preserve">—</w:t>
+            </w:r>
+          </w:p>
+        </w:tc>
+        <w:tc>
+          <w:tcPr>
+            <w:tcMar>
+              <w:top w:type="dxa" w:w="60"/>
+              <w:left w:type="dxa" w:w="120"/>
+              <w:bottom w:type="dxa" w:w="60"/>
+              <w:right w:type="dxa" w:w="120"/>
+            </w:tcMar>
+          </w:tcPr>
+          <w:p>
+            <w:r>
+              <w:rPr>
+                <w:rFonts w:ascii="Microsoft JhengHei" w:cs="Microsoft JhengHei" w:eastAsia="Microsoft JhengHei" w:hAnsi="Microsoft JhengHei"/>
+                <w:b w:val="false"/>
+                <w:bCs w:val="false"/>
+                <w:color w:val="374151"/>
+                <w:sz w:val="20"/>
+                <w:szCs w:val="20"/>
+              </w:rPr>
+              <w:t xml:space="preserve">×1.0</w:t>
+            </w:r>
+          </w:p>
+        </w:tc>
+        <w:tc>
+          <w:tcPr>
+            <w:tcMar>
+              <w:top w:type="dxa" w:w="60"/>
+              <w:left w:type="dxa" w:w="120"/>
+              <w:bottom w:type="dxa" w:w="60"/>
+              <w:right w:type="dxa" w:w="120"/>
+            </w:tcMar>
+          </w:tcPr>
+          <w:p>
+            <w:r>
+              <w:rPr>
+                <w:rFonts w:ascii="Microsoft JhengHei" w:cs="Microsoft JhengHei" w:eastAsia="Microsoft JhengHei" w:hAnsi="Microsoft JhengHei"/>
+                <w:b w:val="false"/>
+                <w:bCs w:val="false"/>
+                <w:color w:val="374151"/>
+                <w:sz w:val="20"/>
+                <w:szCs w:val="20"/>
+              </w:rPr>
+              <w:t xml:space="preserve">—</w:t>
+            </w:r>
+          </w:p>
+        </w:tc>
+        <w:tc>
+          <w:tcPr>
+            <w:tcMar>
+              <w:top w:type="dxa" w:w="60"/>
+              <w:left w:type="dxa" w:w="120"/>
+              <w:bottom w:type="dxa" w:w="60"/>
+              <w:right w:type="dxa" w:w="120"/>
+            </w:tcMar>
+          </w:tcPr>
+          <w:p>
+            <w:r>
+              <w:rPr>
+                <w:rFonts w:ascii="Microsoft JhengHei" w:cs="Microsoft JhengHei" w:eastAsia="Microsoft JhengHei" w:hAnsi="Microsoft JhengHei"/>
+                <w:b w:val="false"/>
+                <w:bCs w:val="false"/>
+                <w:color w:val="374151"/>
+                <w:sz w:val="20"/>
+                <w:szCs w:val="20"/>
+              </w:rPr>
+              <w:t xml:space="preserve">—</w:t>
+            </w:r>
+          </w:p>
+        </w:tc>
+      </w:tr>
+      <w:tr>
+        <w:tc>
+          <w:tcPr>
+            <w:shd w:color="F9FAFB" w:val="solid"/>
+            <w:tcMar>
+              <w:top w:type="dxa" w:w="60"/>
+              <w:left w:type="dxa" w:w="120"/>
+              <w:bottom w:type="dxa" w:w="60"/>
+              <w:right w:type="dxa" w:w="120"/>
+            </w:tcMar>
+          </w:tcPr>
+          <w:p>
+            <w:r>
+              <w:rPr>
+                <w:rFonts w:ascii="Microsoft JhengHei" w:cs="Microsoft JhengHei" w:eastAsia="Microsoft JhengHei" w:hAnsi="Microsoft JhengHei"/>
+                <w:b w:val="false"/>
+                <w:bCs w:val="false"/>
+                <w:color w:val="374151"/>
+                <w:sz w:val="20"/>
+                <w:szCs w:val="20"/>
+              </w:rPr>
               <w:t xml:space="preserve">人際</w:t>
             </w:r>
           </w:p>
         </w:tc>
         <w:tc>
           <w:tcPr>
+            <w:shd w:color="F9FAFB" w:val="solid"/>
             <w:tcMar>
               <w:top w:type="dxa" w:w="60"/>
               <w:left w:type="dxa" w:w="120"/>
@@ -5015,6 +5898,7 @@
         </w:tc>
         <w:tc>
           <w:tcPr>
+            <w:shd w:color="F9FAFB" w:val="solid"/>
             <w:tcMar>
               <w:top w:type="dxa" w:w="60"/>
               <w:left w:type="dxa" w:w="120"/>
@@ -5038,6 +5922,7 @@
         </w:tc>
         <w:tc>
           <w:tcPr>
+            <w:shd w:color="F9FAFB" w:val="solid"/>
             <w:tcMar>
               <w:top w:type="dxa" w:w="60"/>
               <w:left w:type="dxa" w:w="120"/>
@@ -5061,6 +5946,7 @@
         </w:tc>
         <w:tc>
           <w:tcPr>
+            <w:shd w:color="F9FAFB" w:val="solid"/>
             <w:tcMar>
               <w:top w:type="dxa" w:w="60"/>
               <w:left w:type="dxa" w:w="120"/>
@@ -5084,6 +5970,7 @@
         </w:tc>
         <w:tc>
           <w:tcPr>
+            <w:shd w:color="F9FAFB" w:val="solid"/>
             <w:tcMar>
               <w:top w:type="dxa" w:w="60"/>
               <w:left w:type="dxa" w:w="120"/>
@@ -5107,6 +5994,7 @@
         </w:tc>
         <w:tc>
           <w:tcPr>
+            <w:shd w:color="F9FAFB" w:val="solid"/>
             <w:tcMar>
               <w:top w:type="dxa" w:w="60"/>
               <w:left w:type="dxa" w:w="120"/>
@@ -5145,7 +6033,7 @@
           <w:sz w:val="22"/>
           <w:szCs w:val="22"/>
         </w:rPr>
-        <w:t xml:space="preserve">說明：工作時數分配給「調整時間 30%」+「強化能力 70%」；學習時數分配給「增加技能 50%」+「增加知識 50%」。</w:t>
+        <w:t xml:space="preserve">說明：工作時數分配給「調整時間 30%」+「強化能力 70%」；學習時數分配給「增加技能 50%」+「增加知識 50%」；休息與鍛鍊皆 100% 歸入「增加體力」（區別在於一個是被動恢復，一個是主動投資）。</w:t>
       </w:r>
     </w:p>
     <w:p>

</xml_diff>